<commit_message>
Small change to Quiet doctrine
</commit_message>
<xml_diff>
--- a/ManifestoOfTheHighResonant.docx
+++ b/ManifestoOfTheHighResonant.docx
@@ -3062,7 +3062,13 @@
         <w:t xml:space="preserve">heard and felt </w:t>
       </w:r>
       <w:r>
-        <w:t>from within. When a soul is attuned to the Resonance, it does not silence the body. It purifies it. You no longer feel hunger. You no longer feel fear. You feel nought but the vibration of the silence. The vibration of purity.</w:t>
+        <w:t>from within. When a soul is attuned to the Resonance, it does not silence the body. It purifies it. You no longer feel hunger. You no longer feel fear. You feel n</w:t>
+      </w:r>
+      <w:r>
+        <w:t>a</w:t>
+      </w:r>
+      <w:r>
+        <w:t>ught but the vibration of the silence. The vibration of purity.</w:t>
       </w:r>
     </w:p>
     <w:p>
@@ -3228,7 +3234,13 @@
     </w:p>
     <w:p>
       <w:r>
-        <w:t>he Quiet are not monsters. They are the first to be silenced of the Static. Where once there was hunger for power, now stands only the True Note in its wake.</w:t>
+        <w:t xml:space="preserve">he Quiet are not monsters. They are the first to be silenced of the Static. Where once there was hunger for power, now stands only the </w:t>
+      </w:r>
+      <w:r>
+        <w:t>Resonance</w:t>
+      </w:r>
+      <w:r>
+        <w:t xml:space="preserve"> in its wake.</w:t>
       </w:r>
     </w:p>
     <w:p>

</xml_diff>